<commit_message>
feat: alteração no template
</commit_message>
<xml_diff>
--- a/public/templates/template-padrao.docx
+++ b/public/templates/template-padrao.docx
@@ -1853,6 +1853,26 @@
           <w:rFonts w:cs="Arial"/>
         </w:rPr>
       </w:pPr>
+      <w:r>
+        <w:rPr>
+          <w:rFonts w:cs="Arial"/>
+        </w:rPr>
+        <w:t>{#</w:t>
+      </w:r>
+      <w:proofErr w:type="gramStart"/>
+      <w:r>
+        <w:rPr>
+          <w:rFonts w:cs="Arial"/>
+        </w:rPr>
+        <w:t>hasText}{</w:t>
+      </w:r>
+      <w:proofErr w:type="gramEnd"/>
+      <w:r>
+        <w:rPr>
+          <w:rFonts w:cs="Arial"/>
+        </w:rPr>
+        <w:t>text}{/hasText}</w:t>
+      </w:r>
     </w:p>
     <w:p>
       <w:pPr>
@@ -1866,26 +1886,6 @@
           <w:rFonts w:cs="Arial"/>
         </w:rPr>
       </w:pPr>
-      <w:r>
-        <w:rPr>
-          <w:rFonts w:cs="Arial"/>
-        </w:rPr>
-        <w:t>{#</w:t>
-      </w:r>
-      <w:proofErr w:type="gramStart"/>
-      <w:r>
-        <w:rPr>
-          <w:rFonts w:cs="Arial"/>
-        </w:rPr>
-        <w:t>hasText}{</w:t>
-      </w:r>
-      <w:proofErr w:type="gramEnd"/>
-      <w:r>
-        <w:rPr>
-          <w:rFonts w:cs="Arial"/>
-        </w:rPr>
-        <w:t>text}{/hasText}</w:t>
-      </w:r>
     </w:p>
     <w:p>
       <w:pPr>
@@ -1982,19 +1982,6 @@
         </w:rPr>
         <w:t>}</w:t>
       </w:r>
-    </w:p>
-    <w:p>
-      <w:pPr>
-        <w:pStyle w:val="infoblue"/>
-        <w:tabs>
-          <w:tab w:val="center" w:pos="4419"/>
-          <w:tab w:val="right" w:pos="8838"/>
-        </w:tabs>
-        <w:ind w:left="360" w:firstLine="360"/>
-        <w:rPr>
-          <w:rFonts w:cs="Arial"/>
-        </w:rPr>
-      </w:pPr>
     </w:p>
     <w:p>
       <w:pPr>

</xml_diff>